<commit_message>
Brand everything with the Smith Bros logo; show rough estimate and booking button on the website thank-you screen
Co-Authored-By: Claude Sonnet 5.5 <noreply@anthropic.com>
</commit_message>
<xml_diff>
--- a/docs/Smith-Bros-Information-Needed.docx
+++ b/docs/Smith-Bros-Information-Needed.docx
@@ -37,19 +37,47 @@
           </w:tcPr>
           <w:p>
             <w:pPr>
-              <w:spacing w:after="60"/>
+              <w:spacing w:after="100"/>
             </w:pPr>
             <w:r>
-              <w:rPr>
-                <w:rFonts w:ascii="Calibri" w:cs="Calibri" w:eastAsia="Calibri" w:hAnsi="Calibri"/>
-                <w:b/>
-                <w:bCs/>
-                <w:color w:val="D19B38"/>
-                <w:spacing w:val="60"/>
-                <w:sz w:val="18"/>
-                <w:szCs w:val="18"/>
-              </w:rPr>
-              <w:t xml:space="preserve">SMITH BROS FLOORS</w:t>
+              <w:drawing>
+                <wp:inline distT="0" distB="0" distL="0" distR="0">
+                  <wp:extent cx="914400" cy="609600"/>
+                  <wp:effectExtent t="0" r="0" b="0" l="0"/>
+                  <wp:docPr id="1" name="logo" descr="Smith Bros logo" title="Smith Bros"/>
+                  <wp:cNvGraphicFramePr>
+                    <a:graphicFrameLocks xmlns:a="http://schemas.openxmlformats.org/drawingml/2006/main" noChangeAspect="1"/>
+                  </wp:cNvGraphicFramePr>
+                  <a:graphic xmlns:a="http://schemas.openxmlformats.org/drawingml/2006/main">
+                    <a:graphicData uri="http://schemas.openxmlformats.org/drawingml/2006/picture">
+                      <pic:pic xmlns:pic="http://schemas.openxmlformats.org/drawingml/2006/picture">
+                        <pic:nvPicPr>
+                          <pic:cNvPr id="0" name="" descr=""/>
+                          <pic:cNvPicPr>
+                            <a:picLocks noChangeAspect="1" noChangeArrowheads="1"/>
+                          </pic:cNvPicPr>
+                        </pic:nvPicPr>
+                        <pic:blipFill>
+                          <a:blip r:embed="rId8" cstate="none"/>
+                          <a:srcRect/>
+                          <a:stretch>
+                            <a:fillRect/>
+                          </a:stretch>
+                        </pic:blipFill>
+                        <pic:spPr bwMode="auto">
+                          <a:xfrm>
+                            <a:off x="0" y="0"/>
+                            <a:ext cx="914400" cy="609600"/>
+                          </a:xfrm>
+                          <a:prstGeom prst="rect">
+                            <a:avLst/>
+                          </a:prstGeom>
+                        </pic:spPr>
+                      </pic:pic>
+                    </a:graphicData>
+                  </a:graphic>
+                </wp:inline>
+              </w:drawing>
             </w:r>
           </w:p>
           <w:p>
@@ -138,45 +166,6 @@
           <w:szCs w:val="21"/>
         </w:rPr>
         <w:t xml:space="preserve"> Legal name, mailing address, phone, email and GST number (if registered).</w:t>
-      </w:r>
-    </w:p>
-    <w:p>
-      <w:pPr>
-        <w:keepLines/>
-        <w:tabs>
-          <w:tab w:val="left" w:pos="440"/>
-        </w:tabs>
-        <w:spacing w:after="90"/>
-        <w:ind w:left="440" w:hanging="440"/>
-      </w:pPr>
-      <w:r>
-        <w:rPr>
-          <w:rFonts w:ascii="Segoe UI Symbol" w:cs="Segoe UI Symbol" w:eastAsia="Segoe UI Symbol" w:hAnsi="Segoe UI Symbol"/>
-          <w:color w:val="211A16"/>
-          <w:sz w:val="26"/>
-          <w:szCs w:val="26"/>
-        </w:rPr>
-        <w:t xml:space="preserve">☐	</w:t>
-      </w:r>
-      <w:r>
-        <w:rPr>
-          <w:rFonts w:ascii="Calibri" w:cs="Calibri" w:eastAsia="Calibri" w:hAnsi="Calibri"/>
-          <w:b/>
-          <w:bCs/>
-          <w:color w:val="211A16"/>
-          <w:sz w:val="21"/>
-          <w:szCs w:val="21"/>
-        </w:rPr>
-        <w:t xml:space="preserve">Logo.</w:t>
-      </w:r>
-      <w:r>
-        <w:rPr>
-          <w:rFonts w:ascii="Calibri" w:cs="Calibri" w:eastAsia="Calibri" w:hAnsi="Calibri"/>
-          <w:color w:val="3A2F28"/>
-          <w:sz w:val="21"/>
-          <w:szCs w:val="21"/>
-        </w:rPr>
-        <w:t xml:space="preserve"> As a PNG or SVG file.</w:t>
       </w:r>
     </w:p>
     <w:p>

</xml_diff>